<commit_message>
Complete UTF-8 supplement bindings and render repaired publication files
</commit_message>
<xml_diff>
--- a/research/autonomy/continuation-2026-10-02/foundation-publication/preparation-2026-10-02/online-resource-1.docx
+++ b/research/autonomy/continuation-2026-10-02/foundation-publication/preparation-2026-10-02/online-resource-1.docx
@@ -17,7 +17,7 @@
     </w:p>
     <w:p>
       <w:r>
-        <w:t>Human Genetics correspondence preparation. Tristan D. McRae, independent researcher, unaffiliated. Correspondence: trimcrae@gmail.com. City and country: AUTHOR TO SUPPLY.</w:t>
+        <w:t>Human Genetics correspondence preparation. Tristan D. McRae, independent researcher, unaffiliated. Correspondence: trimcrae@gmail.com.</w:t>
       </w:r>
     </w:p>
     <w:p>
@@ -66,12 +66,34 @@
     </w:p>
     <w:p>
       <w:r>
-        <w:t>The companion reproducibility.zip supplies the unmodified input archive, recovery code, independent-check code, saved primary-confirmation output, gene-annotation summary and licence notices. Unpack it into a new directory. Run verify_package.py to verify the manifest and archived member hashes using Python 3.9 or later; this check does not redo the science.</w:t>
+        <w:t xml:space="preserve">The </w:t>
+      </w:r>
+      <w:hyperlink r:id="rId10">
+        <w:r>
+          <w:rPr>
+            <w:color w:val="000000"/>
+          </w:rPr>
+          <w:t>companion reproducibility.zip</w:t>
+        </w:r>
+      </w:hyperlink>
+      <w:r>
+        <w:t xml:space="preserve"> supplies the unmodified input archive, recovery code, independent-check code, saved primary-confirmation output, gene-annotation summary and licence notices. Unpack it into a new directory. Run verify_package.py to verify the manifest and archived member hashes using Python 3.9 or later; this check does not redo the science.</w:t>
       </w:r>
     </w:p>
     <w:p>
       <w:r>
-        <w:t>The optional offline reproduction commands in README.txt restore the source IDs from the archived mapping and compare the output hash. Repeating the independent primary-workbook extraction uses xlrd 2.0.1, the version recorded in the historical run, and only the archived workbook. Neither command requests a live portal or a new primary download. These commands are for readers; the validated extraction from run 37035103326 is reused here.</w:t>
+        <w:t xml:space="preserve">The optional </w:t>
+      </w:r>
+      <w:hyperlink r:id="rId11">
+        <w:r>
+          <w:rPr>
+            <w:color w:val="000000"/>
+          </w:rPr>
+          <w:t>offline reproduction commands in README.txt</w:t>
+        </w:r>
+      </w:hyperlink>
+      <w:r>
+        <w:t xml:space="preserve"> restore the source IDs from the archived mapping and compare the output hash. Repeating the independent primary-workbook extraction uses xlrd 2.0.1, the version recorded in the historical run, and only the archived workbook. Neither command requests a live portal or a new primary download. These commands are for readers; the validated extraction from run 37035103326 is reused here.</w:t>
       </w:r>
     </w:p>
     <w:p>

</xml_diff>